<commit_message>
Projekt pisma dla wydawcy bez noty o podpisie elektronicznym
Co-Authored-By: Claude Opus 5 <noreply@anthropic.com>
Claude-Session: https://claude.ai/code/session_01WR2JsPawQK6ge7oAFtsinp
</commit_message>
<xml_diff>
--- a/attachments/antologia-list-intencyjny.docx
+++ b/attachments/antologia-list-intencyjny.docx
@@ -139,17 +139,6 @@
       </w:pPr>
       <w:r>
         <w:t>podpis, imię i nazwisko, stanowisko</w:t>
-      </w:r>
-    </w:p>
-    <w:p>
-      <w:pPr>
-        <w:spacing w:before="0" w:after="120"/>
-      </w:pPr>
-      <w:r>
-        <w:rPr>
-          <w:sz w:val="17"/>
-        </w:rPr>
-        <w:t>Pismo może zostać opatrzone kwalifikowanym podpisem elektronicznym zamiast podpisu odręcznego i pieczęci.</w:t>
       </w:r>
     </w:p>
     <w:sectPr>

</xml_diff>

<commit_message>
Projekt pisma dla wydawcy zatytułowany listem intencyjnym
Co-Authored-By: Claude Opus 5 <noreply@anthropic.com>
Claude-Session: https://claude.ai/code/session_01WR2JsPawQK6ge7oAFtsinp
</commit_message>
<xml_diff>
--- a/attachments/antologia-list-intencyjny.docx
+++ b/attachments/antologia-list-intencyjny.docx
@@ -69,7 +69,7 @@
         <w:rPr>
           <w:b/>
         </w:rPr>
-        <w:t>OŚWIADCZENIE O WSTĘPNYM ZAINTERESOWANIU</w:t>
+        <w:t>LIST INTENCYJNY</w:t>
       </w:r>
     </w:p>
     <w:p>
@@ -105,7 +105,7 @@
         <w:jc w:val="both"/>
       </w:pPr>
       <w:r>
-        <w:t>Niniejsze oświadczenie nie przesądza o decyzji wydawniczej. Wydawnictwo podejmie ją po zapoznaniu się z pełnym maszynopisem, zgodnie z własnym trybem kwalifikowania tytułów, i nie jest zobowiązane do wydania tomu ani do zawarcia jakiejkolwiek umowy. Oświadczenie nie zawiera zobowiązania finansowego, nie stanowi umowy wydawniczej ani przyrzeczenia jej zawarcia i nie ustala warunków ewentualnej współpracy.</w:t>
+        <w:t>Niniejszy list nie przesądza o decyzji wydawniczej. Wydawnictwo podejmie ją po zapoznaniu się z pełnym maszynopisem, zgodnie z własnym trybem kwalifikowania tytułów, i nie jest zobowiązane do wydania tomu ani do zawarcia jakiejkolwiek umowy. List nie zawiera zobowiązania finansowego, nie stanowi umowy wydawniczej ani przyrzeczenia jej zawarcia i nie ustala warunków ewentualnej współpracy.</w:t>
       </w:r>
     </w:p>
     <w:p>

</xml_diff>